<commit_message>
📊 Daily Chinese DB update: 2026-07-22 | 725/2000 expressions
</commit_message>
<xml_diff>
--- a/data/03_Print_PDF/Study_Note_2026-07-22.docx
+++ b/data/03_Print_PDF/Study_Note_2026-07-22.docx
@@ -33,7 +33,7 @@
           <w:sz w:val="18"/>
           <w:rFonts w:eastAsia="Microsoft YaHei" w:ascii="맑은 고딕"/>
         </w:rPr>
-        <w:t>오늘의 핵심 네이티브 표현  17개  ·  한어 병음 · 한국어 의미 · 원문 · 실전 예문 수록</w:t>
+        <w:t>오늘의 핵심 네이티브 표현  18개  ·  한어 병음 · 한국어 의미 · 원문 · 실전 예문 수록</w:t>
       </w:r>
     </w:p>
     <w:p>
@@ -60,7 +60,7 @@
           <w:sz w:val="28"/>
           <w:rFonts w:eastAsia="Microsoft YaHei" w:ascii="Microsoft YaHei"/>
         </w:rPr>
-        <w:t>得不偿失</w:t>
+        <w:t>心心念念</w:t>
       </w:r>
       <w:r>
         <w:rPr>
@@ -97,7 +97,7 @@
           <w:sz w:val="20"/>
           <w:rFonts w:eastAsia="Microsoft YaHei" w:ascii="Calibri"/>
         </w:rPr>
-        <w:t>débùchángshī</w:t>
+        <w:t>xīn xīn niàn niàn</w:t>
       </w:r>
     </w:p>
     <w:p>
@@ -123,7 +123,7 @@
           <w:sz w:val="21"/>
           <w:rFonts w:eastAsia="Microsoft YaHei" w:ascii="맑은 고딕"/>
         </w:rPr>
-        <w:t>얻는 것보다 잃는 것이 많다, 득보다 실이 크다</w:t>
+        <w:t>간절히 바라다, 늘 마음속으로 염원하다</w:t>
       </w:r>
     </w:p>
     <w:p>
@@ -150,7 +150,7 @@
           <w:sz w:val="19"/>
           <w:rFonts w:eastAsia="Microsoft YaHei" w:ascii="Microsoft YaHei"/>
         </w:rPr>
-        <w:t>"단기적인 이익을 위해 장기적인 관계를 망치는 것은 결국 얻는 것보다 잃는 것이 많을 것입니다."</w:t>
+        <w:t>"独立整洁的学习空间是很多困境青少年心心念念的心愿。"</w:t>
       </w:r>
     </w:p>
     <w:p>
@@ -177,7 +177,7 @@
           <w:sz w:val="21"/>
           <w:rFonts w:eastAsia="Microsoft YaHei" w:ascii="Microsoft YaHei"/>
         </w:rPr>
-        <w:t>为了省一点小钱而浪费大量时间，真是得不偿失。</w:t>
+        <w:t>她终于拿到了心心念念的名企实习录取通知书。</w:t>
       </w:r>
     </w:p>
     <w:p>
@@ -220,7 +220,7 @@
           <w:sz w:val="28"/>
           <w:rFonts w:eastAsia="Microsoft YaHei" w:ascii="Microsoft YaHei"/>
         </w:rPr>
-        <w:t>心里有数</w:t>
+        <w:t>不问青红皂白</w:t>
       </w:r>
       <w:r>
         <w:rPr>
@@ -257,7 +257,7 @@
           <w:sz w:val="20"/>
           <w:rFonts w:eastAsia="Microsoft YaHei" w:ascii="Calibri"/>
         </w:rPr>
-        <w:t>xīnli yǒushù</w:t>
+        <w:t>bù wèn qīng hóng zào bái</w:t>
       </w:r>
     </w:p>
     <w:p>
@@ -283,7 +283,7 @@
           <w:sz w:val="21"/>
           <w:rFonts w:eastAsia="Microsoft YaHei" w:ascii="맑은 고딕"/>
         </w:rPr>
-        <w:t>잘 알고 있다, 속으로 헤아리고 있다, 짐작하고 있다</w:t>
+        <w:t>사정이나 앞뒤 맥락을 따지지도 않고 무작정</w:t>
       </w:r>
     </w:p>
     <w:p>
@@ -310,7 +310,7 @@
           <w:sz w:val="19"/>
           <w:rFonts w:eastAsia="Microsoft YaHei" w:ascii="Microsoft YaHei"/>
         </w:rPr>
-        <w:t>"프로젝트 진행 상황에 대해 그는 이미 잘 알고 있을 것입니다."</w:t>
+        <w:t>"海上一有风吹草动，有人就不问青红皂白地把责任推给别人。"</w:t>
       </w:r>
     </w:p>
     <w:p>
@@ -337,7 +337,7 @@
           <w:sz w:val="21"/>
           <w:rFonts w:eastAsia="Microsoft YaHei" w:ascii="Microsoft YaHei"/>
         </w:rPr>
-        <w:t>虽然他没说，但我知道他心里有数，一切都在计划中。</w:t>
+        <w:t>你不能不问青红皂白就批评下属，先听听他的解释。</w:t>
       </w:r>
     </w:p>
     <w:p>
@@ -380,7 +380,7 @@
           <w:sz w:val="28"/>
           <w:rFonts w:eastAsia="Microsoft YaHei" w:ascii="Microsoft YaHei"/>
         </w:rPr>
-        <w:t>一窍不通</w:t>
+        <w:t>风吹草动</w:t>
       </w:r>
       <w:r>
         <w:rPr>
@@ -417,7 +417,7 @@
           <w:sz w:val="20"/>
           <w:rFonts w:eastAsia="Microsoft YaHei" w:ascii="Calibri"/>
         </w:rPr>
-        <w:t>yīqiàobùtōng</w:t>
+        <w:t>fēng chuī cǎo dòng</w:t>
       </w:r>
     </w:p>
     <w:p>
@@ -443,7 +443,7 @@
           <w:sz w:val="21"/>
           <w:rFonts w:eastAsia="Microsoft YaHei" w:ascii="맑은 고딕"/>
         </w:rPr>
-        <w:t>문외한이다, 전혀 알지 못하다</w:t>
+        <w:t>미세한 변화나 소문, 조그만 기척</w:t>
       </w:r>
     </w:p>
     <w:p>
@@ -470,7 +470,7 @@
           <w:sz w:val="19"/>
           <w:rFonts w:eastAsia="Microsoft YaHei" w:ascii="Microsoft YaHei"/>
         </w:rPr>
-        <w:t>"저는 경제학에 대해 전혀 알지 못해서 관련 기사를 읽어도 이해하기 어렵습니다."</w:t>
+        <w:t>"哪怕海面上有一点风吹草动，某些媒体就会过度炒作。"</w:t>
       </w:r>
     </w:p>
     <w:p>
@@ -497,7 +497,7 @@
           <w:sz w:val="21"/>
           <w:rFonts w:eastAsia="Microsoft YaHei" w:ascii="Microsoft YaHei"/>
         </w:rPr>
-        <w:t>我对电脑维修一窍不通，完全不知道该怎么办。</w:t>
+        <w:t>行业内一有风吹草动，很多投资者就会变得非常敏感。</w:t>
       </w:r>
     </w:p>
     <w:p>
@@ -540,7 +540,7 @@
           <w:sz w:val="28"/>
           <w:rFonts w:eastAsia="Microsoft YaHei" w:ascii="Microsoft YaHei"/>
         </w:rPr>
-        <w:t>封顶</w:t>
+        <w:t>攀比</w:t>
       </w:r>
       <w:r>
         <w:rPr>
@@ -577,7 +577,7 @@
           <w:sz w:val="20"/>
           <w:rFonts w:eastAsia="Microsoft YaHei" w:ascii="Calibri"/>
         </w:rPr>
-        <w:t>fēng dǐng</w:t>
+        <w:t>pān bǐ</w:t>
       </w:r>
     </w:p>
     <w:p>
@@ -603,7 +603,7 @@
           <w:sz w:val="21"/>
           <w:rFonts w:eastAsia="Microsoft YaHei" w:ascii="맑은 고딕"/>
         </w:rPr>
-        <w:t>(건물 등) 골조 공사를 마치다, 상량하다; (수치 등이) 최고치에 달하다</w:t>
+        <w:t>남과 비교하며 과소비하거나 허세를 부리다</w:t>
       </w:r>
     </w:p>
     <w:p>
@@ -630,7 +630,7 @@
           <w:sz w:val="19"/>
           <w:rFonts w:eastAsia="Microsoft YaHei" w:ascii="Microsoft YaHei"/>
         </w:rPr>
-        <w:t>"副中心又一家国企总部大楼主体封顶！"</w:t>
+        <w:t>"高考结束后，不少学生盲目攀比买高档电子产品，增加了家长的负担。"</w:t>
       </w:r>
     </w:p>
     <w:p>
@@ -657,7 +657,7 @@
           <w:sz w:val="21"/>
           <w:rFonts w:eastAsia="Microsoft YaHei" w:ascii="Microsoft YaHei"/>
         </w:rPr>
-        <w:t>经过两年的建设，新博物馆的主体工程终于顺利封顶了。</w:t>
+        <w:t>年轻人消费要理性，不要盲目和别人攀比。</w:t>
       </w:r>
     </w:p>
     <w:p>
@@ -700,7 +700,7 @@
           <w:sz w:val="28"/>
           <w:rFonts w:eastAsia="Microsoft YaHei" w:ascii="Microsoft YaHei"/>
         </w:rPr>
-        <w:t>夯实</w:t>
+        <w:t>掏腰包</w:t>
       </w:r>
       <w:r>
         <w:rPr>
@@ -711,7 +711,7 @@
           <w:sz w:val="18"/>
           <w:rFonts w:eastAsia="Microsoft YaHei" w:ascii="Calibri"/>
         </w:rPr>
-        <w:t xml:space="preserve">   [동사]</w:t>
+        <w:t xml:space="preserve">   [관용구]</w:t>
       </w:r>
     </w:p>
     <w:p>
@@ -737,7 +737,7 @@
           <w:sz w:val="20"/>
           <w:rFonts w:eastAsia="Microsoft YaHei" w:ascii="Calibri"/>
         </w:rPr>
-        <w:t>hāng shí</w:t>
+        <w:t>tāo yāo bāo</w:t>
       </w:r>
     </w:p>
     <w:p>
@@ -763,7 +763,7 @@
           <w:sz w:val="21"/>
           <w:rFonts w:eastAsia="Microsoft YaHei" w:ascii="맑은 고딕"/>
         </w:rPr>
-        <w:t>(기초를) 다지다, 튼튼히 하다, 공고히 하다</w:t>
+        <w:t>자기 지갑을 열다, 사비를 들이다</w:t>
       </w:r>
     </w:p>
     <w:p>
@@ -790,7 +790,7 @@
           <w:sz w:val="19"/>
           <w:rFonts w:eastAsia="Microsoft YaHei" w:ascii="Microsoft YaHei"/>
         </w:rPr>
-        <w:t>"双权威绿标加持，大王椰持续夯实家居板材健康底色."</w:t>
+        <w:t>"为了给高考毕业的孩子的“成人礼”买单，许多父母不得不掏腰包。"</w:t>
       </w:r>
     </w:p>
     <w:p>
@@ -817,7 +817,7 @@
           <w:sz w:val="21"/>
           <w:rFonts w:eastAsia="Microsoft YaHei" w:ascii="Microsoft YaHei"/>
         </w:rPr>
-        <w:t>我们要持续夯实技术基础，才能在激烈的市场竞争中立于不败之地。</w:t>
+        <w:t>这次部门聚会的费用全部由主管掏腰包了。</w:t>
       </w:r>
     </w:p>
     <w:p>
@@ -860,7 +860,7 @@
           <w:sz w:val="28"/>
           <w:rFonts w:eastAsia="Microsoft YaHei" w:ascii="Microsoft YaHei"/>
         </w:rPr>
-        <w:t>直面</w:t>
+        <w:t>铺路</w:t>
       </w:r>
       <w:r>
         <w:rPr>
@@ -871,7 +871,7 @@
           <w:sz w:val="18"/>
           <w:rFonts w:eastAsia="Microsoft YaHei" w:ascii="Calibri"/>
         </w:rPr>
-        <w:t xml:space="preserve">   [동사]</w:t>
+        <w:t xml:space="preserve">   [이합사]</w:t>
       </w:r>
     </w:p>
     <w:p>
@@ -897,7 +897,7 @@
           <w:sz w:val="20"/>
           <w:rFonts w:eastAsia="Microsoft YaHei" w:ascii="Calibri"/>
         </w:rPr>
-        <w:t>zhí miàn</w:t>
+        <w:t>pū lù</w:t>
       </w:r>
     </w:p>
     <w:p>
@@ -923,7 +923,7 @@
           <w:sz w:val="21"/>
           <w:rFonts w:eastAsia="Microsoft YaHei" w:ascii="맑은 고딕"/>
         </w:rPr>
-        <w:t>(문제 등을) 정면으로 마주하다, 직시하다</w:t>
+        <w:t>미래를 위해 기반을 다지다, 길을 터주다</w:t>
       </w:r>
     </w:p>
     <w:p>
@@ -950,7 +950,7 @@
           <w:sz w:val="19"/>
           <w:rFonts w:eastAsia="Microsoft YaHei" w:ascii="Microsoft YaHei"/>
         </w:rPr>
-        <w:t>"首期直面“家底”与“短...”"</w:t>
+        <w:t>"政府推进就业保障政策，就是为了给年轻人的未来发展铺路。"</w:t>
       </w:r>
     </w:p>
     <w:p>
@@ -977,7 +977,7 @@
           <w:sz w:val="21"/>
           <w:rFonts w:eastAsia="Microsoft YaHei" w:ascii="Microsoft YaHei"/>
         </w:rPr>
-        <w:t>面对经济下行的压力，我们必须直面挑战，积极寻求解决方案。</w:t>
+        <w:t>父母辛辛苦苦工作，就是为了给孩子的未来铺路。</w:t>
       </w:r>
     </w:p>
     <w:p>
@@ -1020,7 +1020,7 @@
           <w:sz w:val="28"/>
           <w:rFonts w:eastAsia="Microsoft YaHei" w:ascii="Microsoft YaHei"/>
         </w:rPr>
-        <w:t>增资</w:t>
+        <w:t>摸底</w:t>
       </w:r>
       <w:r>
         <w:rPr>
@@ -1031,7 +1031,7 @@
           <w:sz w:val="18"/>
           <w:rFonts w:eastAsia="Microsoft YaHei" w:ascii="Calibri"/>
         </w:rPr>
-        <w:t xml:space="preserve">   [이합사]</w:t>
+        <w:t xml:space="preserve">   [동사]</w:t>
       </w:r>
     </w:p>
     <w:p>
@@ -1057,7 +1057,7 @@
           <w:sz w:val="20"/>
           <w:rFonts w:eastAsia="Microsoft YaHei" w:ascii="Calibri"/>
         </w:rPr>
-        <w:t>zēng zī</w:t>
+        <w:t>mō dǐ</w:t>
       </w:r>
     </w:p>
     <w:p>
@@ -1083,7 +1083,7 @@
           <w:sz w:val="21"/>
           <w:rFonts w:eastAsia="Microsoft YaHei" w:ascii="맑은 고딕"/>
         </w:rPr>
-        <w:t>(회사, 기업 등이) 자본금을 늘리다, 증자하다</w:t>
+        <w:t>사전에 정황, 실태, 실력을 사전에 조사하거나 파악하다</w:t>
       </w:r>
     </w:p>
     <w:p>
@@ -1110,7 +1110,7 @@
           <w:sz w:val="19"/>
           <w:rFonts w:eastAsia="Microsoft YaHei" w:ascii="Microsoft YaHei"/>
         </w:rPr>
-        <w:t>"大连重工：全资子公司增资完成工商变更登记."</w:t>
+        <w:t>"相关部门在出台新政策前，对新就业形态劳动者的人数进行了摸底。"</w:t>
       </w:r>
     </w:p>
     <w:p>
@@ -1137,7 +1137,7 @@
           <w:sz w:val="21"/>
           <w:rFonts w:eastAsia="Microsoft YaHei" w:ascii="Microsoft YaHei"/>
         </w:rPr>
-        <w:t>为了扩大生产规模，公司决定向股东募集资金进行增资。</w:t>
+        <w:t>开会前，我们要对客户的需求做一个详细的摸底。</w:t>
       </w:r>
     </w:p>
     <w:p>
@@ -1180,7 +1180,7 @@
           <w:sz w:val="28"/>
           <w:rFonts w:eastAsia="Microsoft YaHei" w:ascii="Microsoft YaHei"/>
         </w:rPr>
-        <w:t>引进人才</w:t>
+        <w:t>散心</w:t>
       </w:r>
       <w:r>
         <w:rPr>
@@ -1191,7 +1191,7 @@
           <w:sz w:val="18"/>
           <w:rFonts w:eastAsia="Microsoft YaHei" w:ascii="Calibri"/>
         </w:rPr>
-        <w:t xml:space="preserve">   [구어]</w:t>
+        <w:t xml:space="preserve">   [이합사]</w:t>
       </w:r>
     </w:p>
     <w:p>
@@ -1217,7 +1217,7 @@
           <w:sz w:val="20"/>
           <w:rFonts w:eastAsia="Microsoft YaHei" w:ascii="Calibri"/>
         </w:rPr>
-        <w:t>yǐn jìn rén cái</w:t>
+        <w:t>sàn xīn</w:t>
       </w:r>
     </w:p>
     <w:p>
@@ -1243,7 +1243,7 @@
           <w:sz w:val="21"/>
           <w:rFonts w:eastAsia="Microsoft YaHei" w:ascii="맑은 고딕"/>
         </w:rPr>
-        <w:t>인재를 유치하다/영입하다</w:t>
+        <w:t>답답한 마음을 달래다, 머리를 식히다</w:t>
       </w:r>
     </w:p>
     <w:p>
@@ -1270,7 +1270,7 @@
           <w:sz w:val="19"/>
           <w:rFonts w:eastAsia="Microsoft YaHei" w:ascii="Microsoft YaHei"/>
         </w:rPr>
-        <w:t>"上海新金山投资控股集团有限公司面向社会引进专业技术人才2名."</w:t>
+        <w:t>"高考结束后，很多考生选择出去旅游散心，缓解长期的压力。"</w:t>
       </w:r>
     </w:p>
     <w:p>
@@ -1297,7 +1297,7 @@
           <w:sz w:val="21"/>
           <w:rFonts w:eastAsia="Microsoft YaHei" w:ascii="Microsoft YaHei"/>
         </w:rPr>
-        <w:t>为了提升科研实力，我们大学每年都致力于引进高水平人才。</w:t>
+        <w:t>工作太累了，周末我想去郊区散散心。</w:t>
       </w:r>
     </w:p>
     <w:p>
@@ -1340,7 +1340,7 @@
           <w:sz w:val="28"/>
           <w:rFonts w:eastAsia="Microsoft YaHei" w:ascii="Microsoft YaHei"/>
         </w:rPr>
-        <w:t>滋事挑衅</w:t>
+        <w:t>交心</w:t>
       </w:r>
       <w:r>
         <w:rPr>
@@ -1351,7 +1351,7 @@
           <w:sz w:val="18"/>
           <w:rFonts w:eastAsia="Microsoft YaHei" w:ascii="Calibri"/>
         </w:rPr>
-        <w:t xml:space="preserve">   [관용구]</w:t>
+        <w:t xml:space="preserve">   [이합사]</w:t>
       </w:r>
     </w:p>
     <w:p>
@@ -1377,7 +1377,7 @@
           <w:sz w:val="20"/>
           <w:rFonts w:eastAsia="Microsoft YaHei" w:ascii="Calibri"/>
         </w:rPr>
-        <w:t>zī shì tiǎo xìn</w:t>
+        <w:t>jiāo xīn</w:t>
       </w:r>
     </w:p>
     <w:p>
@@ -1403,7 +1403,7 @@
           <w:sz w:val="21"/>
           <w:rFonts w:eastAsia="Microsoft YaHei" w:ascii="맑은 고딕"/>
         </w:rPr>
-        <w:t>문제를 일으키고 도발하다</w:t>
+        <w:t>솔직하게 속마음을 나누다</w:t>
       </w:r>
     </w:p>
     <w:p>
@@ -1430,7 +1430,7 @@
           <w:sz w:val="19"/>
           <w:rFonts w:eastAsia="Microsoft YaHei" w:ascii="Microsoft YaHei"/>
         </w:rPr>
-        <w:t>"外交部：敦促菲方立即停止海上滋事挑衅和..."</w:t>
+        <w:t>"社区志愿者走访困境家庭，与青少年交心，了解他们的真实想法。"</w:t>
       </w:r>
     </w:p>
     <w:p>
@@ -1457,7 +1457,7 @@
           <w:sz w:val="21"/>
           <w:rFonts w:eastAsia="Microsoft YaHei" w:ascii="Microsoft YaHei"/>
         </w:rPr>
-        <w:t>任何国家都无权在他国领土上滋事挑衅。</w:t>
+        <w:t>我和他认识多年了，是非常交心的朋友。</w:t>
       </w:r>
     </w:p>
     <w:p>
@@ -1500,7 +1500,7 @@
           <w:sz w:val="28"/>
           <w:rFonts w:eastAsia="Microsoft YaHei" w:ascii="Microsoft YaHei"/>
         </w:rPr>
-        <w:t>规划建设</w:t>
+        <w:t>砸钱</w:t>
       </w:r>
       <w:r>
         <w:rPr>
@@ -1537,7 +1537,7 @@
           <w:sz w:val="20"/>
           <w:rFonts w:eastAsia="Microsoft YaHei" w:ascii="Calibri"/>
         </w:rPr>
-        <w:t>guī huà jiàn shè</w:t>
+        <w:t>zá qián</w:t>
       </w:r>
     </w:p>
     <w:p>
@@ -1563,7 +1563,7 @@
           <w:sz w:val="21"/>
           <w:rFonts w:eastAsia="Microsoft YaHei" w:ascii="맑은 고딕"/>
         </w:rPr>
-        <w:t>계획하고 건설하다</w:t>
+        <w:t>거침없이 많은 돈을 쏟아붓다</w:t>
       </w:r>
     </w:p>
     <w:p>
@@ -1590,7 +1590,7 @@
           <w:sz w:val="19"/>
           <w:rFonts w:eastAsia="Microsoft YaHei" w:ascii="Microsoft YaHei"/>
         </w:rPr>
-        <w:t>"系统推进“六张网”规划建设，国常会再部署."</w:t>
+        <w:t>"不少商家瞄准准考生市场，靠砸钱宣传来吸引消费者。"</w:t>
       </w:r>
     </w:p>
     <w:p>
@@ -1617,7 +1617,7 @@
           <w:sz w:val="21"/>
           <w:rFonts w:eastAsia="Microsoft YaHei" w:ascii="Microsoft YaHei"/>
         </w:rPr>
-        <w:t>城市发展需要长远的规划建设，才能避免盲目扩张。</w:t>
+        <w:t>这个项目光靠砸钱是没用的，关键是要有好的产品设计。</w:t>
       </w:r>
     </w:p>
     <w:p>
@@ -1660,7 +1660,7 @@
           <w:sz w:val="28"/>
           <w:rFonts w:eastAsia="Microsoft YaHei" w:ascii="Microsoft YaHei"/>
         </w:rPr>
-        <w:t>扩大投资</w:t>
+        <w:t>买单</w:t>
       </w:r>
       <w:r>
         <w:rPr>
@@ -1697,7 +1697,7 @@
           <w:sz w:val="20"/>
           <w:rFonts w:eastAsia="Microsoft YaHei" w:ascii="Calibri"/>
         </w:rPr>
-        <w:t>kuò dà tóu zī</w:t>
+        <w:t>mǎi dān</w:t>
       </w:r>
     </w:p>
     <w:p>
@@ -1723,7 +1723,7 @@
           <w:sz w:val="21"/>
           <w:rFonts w:eastAsia="Microsoft YaHei" w:ascii="맑은 고딕"/>
         </w:rPr>
-        <w:t>투자를 확대하다</w:t>
+        <w:t>계산하다, (결과나 실수에 대해) 책임지다</w:t>
       </w:r>
     </w:p>
     <w:p>
@@ -1750,7 +1750,7 @@
           <w:sz w:val="19"/>
           <w:rFonts w:eastAsia="Microsoft YaHei" w:ascii="Microsoft YaHei"/>
         </w:rPr>
-        <w:t>"作为今年扩大有效投资的重要发力点，“六张网”规划建设正迎来密集的政策部署."</w:t>
+        <w:t>"盲目消费的后果，最终还是要由学生和家长自己买单。"</w:t>
       </w:r>
     </w:p>
     <w:p>
@@ -1777,7 +1777,7 @@
           <w:sz w:val="21"/>
           <w:rFonts w:eastAsia="Microsoft YaHei" w:ascii="Microsoft YaHei"/>
         </w:rPr>
-        <w:t>政府鼓励企业扩大投资，以促进经济增长和创造就业机会。</w:t>
+        <w:t>我们做出的每一个决策，都必须自己去买单。</w:t>
       </w:r>
     </w:p>
     <w:p>
@@ -1820,7 +1820,7 @@
           <w:sz w:val="28"/>
           <w:rFonts w:eastAsia="Microsoft YaHei" w:ascii="Microsoft YaHei"/>
         </w:rPr>
-        <w:t>失控</w:t>
+        <w:t>打下手</w:t>
       </w:r>
       <w:r>
         <w:rPr>
@@ -1831,7 +1831,7 @@
           <w:sz w:val="18"/>
           <w:rFonts w:eastAsia="Microsoft YaHei" w:ascii="Calibri"/>
         </w:rPr>
-        <w:t xml:space="preserve">   [이합사]</w:t>
+        <w:t xml:space="preserve">   [관용구]</w:t>
       </w:r>
     </w:p>
     <w:p>
@@ -1857,7 +1857,7 @@
           <w:sz w:val="20"/>
           <w:rFonts w:eastAsia="Microsoft YaHei" w:ascii="Calibri"/>
         </w:rPr>
-        <w:t>shī kòng</w:t>
+        <w:t>dǎ xià shǒu</w:t>
       </w:r>
     </w:p>
     <w:p>
@@ -1883,7 +1883,7 @@
           <w:sz w:val="21"/>
           <w:rFonts w:eastAsia="Microsoft YaHei" w:ascii="맑은 고딕"/>
         </w:rPr>
-        <w:t>통제 불능이 되다, 제어력을 상실하다</w:t>
+        <w:t>보조 역할을 하다, 옆에서 수발을 들다</w:t>
       </w:r>
     </w:p>
     <w:p>
@@ -1910,7 +1910,7 @@
           <w:sz w:val="19"/>
           <w:rFonts w:eastAsia="Microsoft YaHei" w:ascii="Microsoft YaHei"/>
         </w:rPr>
-        <w:t>"失控的监护“外包”：孩子被送特训机构之后."</w:t>
+        <w:t>"新进公司的实习生一般先从打下手开始，慢慢熟悉业务。"</w:t>
       </w:r>
     </w:p>
     <w:p>
@@ -1937,7 +1937,7 @@
           <w:sz w:val="21"/>
           <w:rFonts w:eastAsia="Microsoft YaHei" w:ascii="Microsoft YaHei"/>
         </w:rPr>
-        <w:t>如果不及时采取措施，疫情可能会彻底失控。</w:t>
+        <w:t>今天做饭你主厨，我在旁边给你打下手。</w:t>
       </w:r>
     </w:p>
     <w:p>
@@ -1980,7 +1980,7 @@
           <w:sz w:val="28"/>
           <w:rFonts w:eastAsia="Microsoft YaHei" w:ascii="Microsoft YaHei"/>
         </w:rPr>
-        <w:t>着手</w:t>
+        <w:t>推波助澜</w:t>
       </w:r>
       <w:r>
         <w:rPr>
@@ -1991,7 +1991,7 @@
           <w:sz w:val="18"/>
           <w:rFonts w:eastAsia="Microsoft YaHei" w:ascii="Calibri"/>
         </w:rPr>
-        <w:t xml:space="preserve">   [동사]</w:t>
+        <w:t xml:space="preserve">   [관용구]</w:t>
       </w:r>
     </w:p>
     <w:p>
@@ -2017,7 +2017,7 @@
           <w:sz w:val="20"/>
           <w:rFonts w:eastAsia="Microsoft YaHei" w:ascii="Calibri"/>
         </w:rPr>
-        <w:t>zhuó shǒu</w:t>
+        <w:t>tuī bō zhù lán</w:t>
       </w:r>
     </w:p>
     <w:p>
@@ -2043,7 +2043,7 @@
           <w:sz w:val="21"/>
           <w:rFonts w:eastAsia="Microsoft YaHei" w:ascii="맑은 고딕"/>
         </w:rPr>
-        <w:t>착수하다, 시작하다</w:t>
+        <w:t>부추기다, (일의 상황을) 한층 더 부채질하다</w:t>
       </w:r>
     </w:p>
     <w:p>
@@ -2070,7 +2070,7 @@
           <w:sz w:val="19"/>
           <w:rFonts w:eastAsia="Microsoft YaHei" w:ascii="Microsoft YaHei"/>
         </w:rPr>
-        <w:t>"(새로운 사업/프로젝트 시작 맥락에서 유추)"</w:t>
+        <w:t>"部分商家为了增加销量，在社交平台上推波助澜，炒作过度消费的风气。"</w:t>
       </w:r>
     </w:p>
     <w:p>
@@ -2097,7 +2097,7 @@
           <w:sz w:val="21"/>
           <w:rFonts w:eastAsia="Microsoft YaHei" w:ascii="Microsoft YaHei"/>
         </w:rPr>
-        <w:t>新项目马上要启动了，我们得尽快着手准备。</w:t>
+        <w:t>网络上的不实言论对这次公关危机起到了推波助澜的反效果。</w:t>
       </w:r>
     </w:p>
     <w:p>
@@ -2140,7 +2140,7 @@
           <w:sz w:val="28"/>
           <w:rFonts w:eastAsia="Microsoft YaHei" w:ascii="Microsoft YaHei"/>
         </w:rPr>
-        <w:t>摆脱</w:t>
+        <w:t>兜底</w:t>
       </w:r>
       <w:r>
         <w:rPr>
@@ -2151,7 +2151,7 @@
           <w:sz w:val="18"/>
           <w:rFonts w:eastAsia="Microsoft YaHei" w:ascii="Calibri"/>
         </w:rPr>
-        <w:t xml:space="preserve">   [동사]</w:t>
+        <w:t xml:space="preserve">   [구어]</w:t>
       </w:r>
     </w:p>
     <w:p>
@@ -2177,7 +2177,7 @@
           <w:sz w:val="20"/>
           <w:rFonts w:eastAsia="Microsoft YaHei" w:ascii="Calibri"/>
         </w:rPr>
-        <w:t>bǎi tuō</w:t>
+        <w:t>dōu dǐ</w:t>
       </w:r>
     </w:p>
     <w:p>
@@ -2203,7 +2203,7 @@
           <w:sz w:val="21"/>
           <w:rFonts w:eastAsia="Microsoft YaHei" w:ascii="맑은 고딕"/>
         </w:rPr>
-        <w:t>벗어나다, 떨쳐버리다</w:t>
+        <w:t>최후의 보장을 하다, 끝까지 책임지고 처리해주다</w:t>
       </w:r>
     </w:p>
     <w:p>
@@ -2230,7 +2230,7 @@
           <w:sz w:val="19"/>
           <w:rFonts w:eastAsia="Microsoft YaHei" w:ascii="Microsoft YaHei"/>
         </w:rPr>
-        <w:t>"(어려운 상황이나 제약에서 벗어나는 맥락에서 유추)"</w:t>
+        <w:t>"政府出台了保障政策，为新就业形态劳动者的基本权益兜底。"</w:t>
       </w:r>
     </w:p>
     <w:p>
@@ -2257,7 +2257,7 @@
           <w:sz w:val="21"/>
           <w:rFonts w:eastAsia="Microsoft YaHei" w:ascii="Microsoft YaHei"/>
         </w:rPr>
-        <w:t>他努力工作，终于摆脱了贫困的生活。</w:t>
+        <w:t>你放手去干吧，万一出了什么问题由我们团队来兜底。</w:t>
       </w:r>
     </w:p>
     <w:p>
@@ -2300,7 +2300,7 @@
           <w:sz w:val="28"/>
           <w:rFonts w:eastAsia="Microsoft YaHei" w:ascii="Microsoft YaHei"/>
         </w:rPr>
-        <w:t>达成协议</w:t>
+        <w:t>提上日程</w:t>
       </w:r>
       <w:r>
         <w:rPr>
@@ -2311,7 +2311,7 @@
           <w:sz w:val="18"/>
           <w:rFonts w:eastAsia="Microsoft YaHei" w:ascii="Calibri"/>
         </w:rPr>
-        <w:t xml:space="preserve">   [구어]</w:t>
+        <w:t xml:space="preserve">   [관용구]</w:t>
       </w:r>
     </w:p>
     <w:p>
@@ -2337,7 +2337,7 @@
           <w:sz w:val="20"/>
           <w:rFonts w:eastAsia="Microsoft YaHei" w:ascii="Calibri"/>
         </w:rPr>
-        <w:t>dá chéng xié yì</w:t>
+        <w:t>tí shàng rì chéng</w:t>
       </w:r>
     </w:p>
     <w:p>
@@ -2363,7 +2363,7 @@
           <w:sz w:val="21"/>
           <w:rFonts w:eastAsia="Microsoft YaHei" w:ascii="맑은 고딕"/>
         </w:rPr>
-        <w:t>협의에 도달하다, 합의를 이루다</w:t>
+        <w:t>일정에 올리다, 본격적으로 추진을 시작하다</w:t>
       </w:r>
     </w:p>
     <w:p>
@@ -2390,7 +2390,7 @@
           <w:sz w:val="19"/>
           <w:rFonts w:eastAsia="Microsoft YaHei" w:ascii="Microsoft YaHei"/>
         </w:rPr>
-        <w:t>"(기업 간 협력, 국제 관계 등의 맥락에서 유추)"</w:t>
+        <w:t>"随着新一轮改革推行，个人养老金制度的细则落地已被提上日程。"</w:t>
       </w:r>
     </w:p>
     <w:p>
@@ -2417,7 +2417,7 @@
           <w:sz w:val="21"/>
           <w:rFonts w:eastAsia="Microsoft YaHei" w:ascii="Microsoft YaHei"/>
         </w:rPr>
-        <w:t>经过多轮谈判，双方终于就贸易问题达成了协议。</w:t>
+        <w:t>公司决定将新产品的海外推广计划正式提上日程。</w:t>
       </w:r>
     </w:p>
     <w:p>
@@ -2460,7 +2460,7 @@
           <w:sz w:val="28"/>
           <w:rFonts w:eastAsia="Microsoft YaHei" w:ascii="Microsoft YaHei"/>
         </w:rPr>
-        <w:t>拭目以待</w:t>
+        <w:t>支招</w:t>
       </w:r>
       <w:r>
         <w:rPr>
@@ -2471,7 +2471,7 @@
           <w:sz w:val="18"/>
           <w:rFonts w:eastAsia="Microsoft YaHei" w:ascii="Calibri"/>
         </w:rPr>
-        <w:t xml:space="preserve">   [관용구]</w:t>
+        <w:t xml:space="preserve">   [구어]</w:t>
       </w:r>
     </w:p>
     <w:p>
@@ -2497,7 +2497,7 @@
           <w:sz w:val="20"/>
           <w:rFonts w:eastAsia="Microsoft YaHei" w:ascii="Calibri"/>
         </w:rPr>
-        <w:t>shì mù yǐ dài</w:t>
+        <w:t>zhī zhāo</w:t>
       </w:r>
     </w:p>
     <w:p>
@@ -2523,7 +2523,7 @@
           <w:sz w:val="21"/>
           <w:rFonts w:eastAsia="Microsoft YaHei" w:ascii="맑은 고딕"/>
         </w:rPr>
-        <w:t>눈을 닦고 기다리다; (결과를) 기대하며 지켜보다</w:t>
+        <w:t>아이디어를 주다, 해결책을 제시해 주다</w:t>
       </w:r>
     </w:p>
     <w:p>
@@ -2550,7 +2550,7 @@
           <w:sz w:val="19"/>
           <w:rFonts w:eastAsia="Microsoft YaHei" w:ascii="Microsoft YaHei"/>
         </w:rPr>
-        <w:t>"(발표된 정책이나 프로젝트의 결과를 기대하는 맥락에서 유추)"</w:t>
+        <w:t>"针对困境学子的求职难题，多位行业专家现场为他们支招。"</w:t>
       </w:r>
     </w:p>
     <w:p>
@@ -2577,7 +2577,7 @@
           <w:sz w:val="21"/>
           <w:rFonts w:eastAsia="Microsoft YaHei" w:ascii="Microsoft YaHei"/>
         </w:rPr>
-        <w:t>这部电影备受期待，观众们都拭目以待它的上映。</w:t>
+        <w:t>面对这么棘手的客户投诉，老同事给刚入职的我支了几招。</w:t>
       </w:r>
     </w:p>
     <w:p>
@@ -2620,7 +2620,167 @@
           <w:sz w:val="28"/>
           <w:rFonts w:eastAsia="Microsoft YaHei" w:ascii="Microsoft YaHei"/>
         </w:rPr>
-        <w:t>顺理成章</w:t>
+        <w:t>明眼人</w:t>
+      </w:r>
+      <w:r>
+        <w:rPr>
+          <w:rFonts w:ascii="Calibri" w:hAnsi="Calibri"/>
+          <w:b w:val="0"/>
+          <w:i w:val="0"/>
+          <w:color w:val="787878"/>
+          <w:sz w:val="18"/>
+          <w:rFonts w:eastAsia="Microsoft YaHei" w:ascii="Calibri"/>
+        </w:rPr>
+        <w:t xml:space="preserve">   [명사]</w:t>
+      </w:r>
+    </w:p>
+    <w:p>
+      <w:pPr>
+        <w:spacing w:before="0" w:after="40"/>
+      </w:pPr>
+      <w:r>
+        <w:rPr>
+          <w:rFonts w:ascii="맑은 고딕" w:hAnsi="맑은 고딕"/>
+          <w:b w:val="0"/>
+          <w:i w:val="0"/>
+          <w:sz w:val="20"/>
+          <w:rFonts w:eastAsia="Microsoft YaHei" w:ascii="맑은 고딕"/>
+        </w:rPr>
+        <w:t xml:space="preserve">🔊 </w:t>
+      </w:r>
+      <w:r>
+        <w:rPr>
+          <w:rFonts w:ascii="Calibri" w:hAnsi="Calibri"/>
+          <w:b w:val="0"/>
+          <w:i/>
+          <w:color w:val="505050"/>
+          <w:sz w:val="20"/>
+          <w:rFonts w:eastAsia="Microsoft YaHei" w:ascii="Calibri"/>
+        </w:rPr>
+        <w:t>míng yǎn rén</w:t>
+      </w:r>
+    </w:p>
+    <w:p>
+      <w:pPr>
+        <w:spacing w:before="0" w:after="60"/>
+      </w:pPr>
+      <w:r>
+        <w:rPr>
+          <w:rFonts w:ascii="맑은 고딕" w:hAnsi="맑은 고딕"/>
+          <w:b/>
+          <w:i w:val="0"/>
+          <w:color w:val="282828"/>
+          <w:sz w:val="20"/>
+          <w:rFonts w:eastAsia="Microsoft YaHei" w:ascii="맑은 고딕"/>
+        </w:rPr>
+        <w:t xml:space="preserve">💡 의미  </w:t>
+      </w:r>
+      <w:r>
+        <w:rPr>
+          <w:rFonts w:ascii="맑은 고딕" w:hAnsi="맑은 고딕"/>
+          <w:b w:val="0"/>
+          <w:i w:val="0"/>
+          <w:sz w:val="21"/>
+          <w:rFonts w:eastAsia="Microsoft YaHei" w:ascii="맑은 고딕"/>
+        </w:rPr>
+        <w:t>통찰력 있는 사람, 상황을 똑똑히 알아채는 사리 밝은 사람</w:t>
+      </w:r>
+    </w:p>
+    <w:p>
+      <w:pPr>
+        <w:spacing w:before="0" w:after="40"/>
+      </w:pPr>
+      <w:r>
+        <w:rPr>
+          <w:rFonts w:ascii="맑은 고딕" w:hAnsi="맑은 고딕"/>
+          <w:b/>
+          <w:i w:val="0"/>
+          <w:color w:val="646464"/>
+          <w:sz w:val="19"/>
+          <w:rFonts w:eastAsia="Microsoft YaHei" w:ascii="맑은 고딕"/>
+        </w:rPr>
+        <w:t xml:space="preserve">📌 원문  </w:t>
+      </w:r>
+      <w:r>
+        <w:rPr>
+          <w:rFonts w:ascii="Microsoft YaHei" w:hAnsi="Microsoft YaHei"/>
+          <w:b w:val="0"/>
+          <w:i/>
+          <w:color w:val="5A5A5A"/>
+          <w:sz w:val="19"/>
+          <w:rFonts w:eastAsia="Microsoft YaHei" w:ascii="Microsoft YaHei"/>
+        </w:rPr>
+        <w:t>"明眼人都能看得出，这次策略调整是为了顺应未来的政策导向。"</w:t>
+      </w:r>
+    </w:p>
+    <w:p>
+      <w:pPr>
+        <w:spacing w:before="40" w:after="40"/>
+      </w:pPr>
+      <w:r>
+        <w:rPr>
+          <w:rFonts w:ascii="맑은 고딕" w:hAnsi="맑은 고딕"/>
+          <w:b/>
+          <w:i w:val="0"/>
+          <w:color w:val="007850"/>
+          <w:sz w:val="20"/>
+          <w:rFonts w:eastAsia="Microsoft YaHei" w:ascii="맑은 고딕"/>
+        </w:rPr>
+        <w:t xml:space="preserve">✏️ 예문  </w:t>
+      </w:r>
+      <w:r>
+        <w:rPr>
+          <w:rFonts w:ascii="Microsoft YaHei" w:hAnsi="Microsoft YaHei"/>
+          <w:b/>
+          <w:i w:val="0"/>
+          <w:color w:val="00643C"/>
+          <w:sz w:val="21"/>
+          <w:rFonts w:eastAsia="Microsoft YaHei" w:ascii="Microsoft YaHei"/>
+        </w:rPr>
+        <w:t>这明显是个商业陷阱，稍有经验的明眼人一扫就能看穿。</w:t>
+      </w:r>
+    </w:p>
+    <w:p>
+      <w:pPr>
+        <w:spacing w:before="120" w:after="0"/>
+      </w:pPr>
+      <w:r>
+        <w:rPr>
+          <w:rFonts w:ascii="맑은 고딕" w:hAnsi="맑은 고딕"/>
+          <w:b w:val="0"/>
+          <w:i w:val="0"/>
+          <w:color w:val="C8C8C8"/>
+          <w:sz w:val="14"/>
+          <w:rFonts w:eastAsia="Microsoft YaHei" w:ascii="맑은 고딕"/>
+        </w:rPr>
+        <w:t>────────────────────────────────────────────────────────────</w:t>
+      </w:r>
+    </w:p>
+    <w:p>
+      <w:pPr>
+        <w:spacing w:before="200" w:after="40"/>
+      </w:pPr>
+      <w:r>
+        <w:rPr>
+          <w:rFonts w:ascii="맑은 고딕" w:hAnsi="맑은 고딕"/>
+          <w:b w:val="0"/>
+          <w:i w:val="0"/>
+          <w:color w:val="969696"/>
+          <w:sz w:val="20"/>
+          <w:rFonts w:eastAsia="Microsoft YaHei" w:ascii="맑은 고딕"/>
+        </w:rPr>
+        <w:t xml:space="preserve">018.  </w:t>
+      </w:r>
+      <w:r>
+        <w:rPr>
+          <w:rFonts w:ascii="Microsoft YaHei" w:hAnsi="Microsoft YaHei"/>
+          <w:b/>
+          <w:i w:val="0"/>
+          <w:color w:val="143CB4"/>
+          <w:sz w:val="28"/>
+          <w:rFonts w:eastAsia="Microsoft YaHei" w:ascii="Microsoft YaHei"/>
+        </w:rPr>
+        <w:t>见缝插针</w:t>
       </w:r>
       <w:r>
         <w:rPr>
@@ -2657,7 +2817,7 @@
           <w:sz w:val="20"/>
           <w:rFonts w:eastAsia="Microsoft YaHei" w:ascii="Calibri"/>
         </w:rPr>
-        <w:t>shùn lǐ chéng zhāng</w:t>
+        <w:t>jiàn fèng chā zhēn</w:t>
       </w:r>
     </w:p>
     <w:p>
@@ -2683,7 +2843,7 @@
           <w:sz w:val="21"/>
           <w:rFonts w:eastAsia="Microsoft YaHei" w:ascii="맑은 고딕"/>
         </w:rPr>
-        <w:t>이치에 맞아 당연하다, 순리대로 이루어지다</w:t>
+        <w:t>짬을 내다, 바쁜 와중에도 틈을 활용하다</w:t>
       </w:r>
     </w:p>
     <w:p>
@@ -2710,7 +2870,7 @@
           <w:sz w:val="19"/>
           <w:rFonts w:eastAsia="Microsoft YaHei" w:ascii="Microsoft YaHei"/>
         </w:rPr>
-        <w:t>"(특정 결과나 상황이 자연스러운 흐름에 따라 발생한다는 맥락에서 유추)"</w:t>
+        <w:t>"很多职场年轻人见缝插针地利用日常碎片时间学习第二外语。"</w:t>
       </w:r>
     </w:p>
     <w:p>
@@ -2737,7 +2897,7 @@
           <w:sz w:val="21"/>
           <w:rFonts w:eastAsia="Microsoft YaHei" w:ascii="Microsoft YaHei"/>
         </w:rPr>
-        <w:t>他的努力工作와 우수한 성과를 고려할 때, 승진은 순리성장한 일이다.</w:t>
+        <w:t>出差行程安排得非常紧，他只能见缝插针地在高铁上批改文件。</w:t>
       </w:r>
     </w:p>
     <w:sectPr>

</xml_diff>